<commit_message>
chore: add checkbox in simple.docx
</commit_message>
<xml_diff>
--- a/templates/simple.docx
+++ b/templates/simple.docx
@@ -15,66 +15,132 @@
     </w:p>
     <w:p>
       <w:r>
-        <w:t>성명: {</w:t>
+        <w:t xml:space="preserve">성명: </w:t>
+      </w:r>
+      <w:r>
+        <w:rPr>
+          <w:b/>
+          <w:bCs/>
+        </w:rPr>
+        <w:t>{</w:t>
       </w:r>
       <w:proofErr w:type="gramStart"/>
       <w:r>
+        <w:rPr>
+          <w:b/>
+          <w:bCs/>
+        </w:rPr>
         <w:t>인적사항.성명</w:t>
       </w:r>
       <w:proofErr w:type="gramEnd"/>
       <w:r>
+        <w:rPr>
+          <w:b/>
+          <w:bCs/>
+        </w:rPr>
         <w:t>}</w:t>
       </w:r>
     </w:p>
     <w:p>
       <w:r>
-        <w:t>주소: {</w:t>
+        <w:t xml:space="preserve">주소: </w:t>
+      </w:r>
+      <w:r>
+        <w:rPr>
+          <w:color w:val="EE0000"/>
+        </w:rPr>
+        <w:t>{</w:t>
       </w:r>
       <w:proofErr w:type="gramStart"/>
       <w:r>
+        <w:rPr>
+          <w:color w:val="EE0000"/>
+        </w:rPr>
         <w:t>인적사항.주소</w:t>
       </w:r>
       <w:proofErr w:type="gramEnd"/>
       <w:r>
+        <w:rPr>
+          <w:color w:val="EE0000"/>
+        </w:rPr>
         <w:t>}</w:t>
       </w:r>
     </w:p>
     <w:p>
       <w:r>
-        <w:t>연락처: {</w:t>
+        <w:t xml:space="preserve">연락처: </w:t>
+      </w:r>
+      <w:r>
+        <w:rPr>
+          <w:i/>
+          <w:iCs/>
+        </w:rPr>
+        <w:t>{</w:t>
       </w:r>
       <w:proofErr w:type="gramStart"/>
       <w:r>
+        <w:rPr>
+          <w:i/>
+          <w:iCs/>
+        </w:rPr>
         <w:t>인적사항.연락처</w:t>
       </w:r>
       <w:proofErr w:type="gramEnd"/>
       <w:r>
+        <w:rPr>
+          <w:i/>
+          <w:iCs/>
+        </w:rPr>
         <w:t>}</w:t>
       </w:r>
     </w:p>
     <w:p>
       <w:r>
-        <w:t>이메일: {</w:t>
+        <w:t xml:space="preserve">이메일: </w:t>
+      </w:r>
+      <w:r>
+        <w:rPr>
+          <w:strike/>
+        </w:rPr>
+        <w:t>{</w:t>
       </w:r>
       <w:proofErr w:type="gramStart"/>
       <w:r>
+        <w:rPr>
+          <w:strike/>
+        </w:rPr>
         <w:t>인적사항.이메일</w:t>
       </w:r>
       <w:proofErr w:type="gramEnd"/>
       <w:r>
+        <w:rPr>
+          <w:strike/>
+        </w:rPr>
         <w:t>}</w:t>
       </w:r>
     </w:p>
     <w:p>
       <w:r>
-        <w:t>생년월일: {</w:t>
+        <w:t xml:space="preserve">생년월일: </w:t>
+      </w:r>
+      <w:r>
+        <w:rPr>
+          <w:rStyle w:val="1Char"/>
+        </w:rPr>
+        <w:t>{</w:t>
       </w:r>
       <w:proofErr w:type="gramStart"/>
       <w:r>
+        <w:rPr>
+          <w:rStyle w:val="1Char"/>
+        </w:rPr>
         <w:t>인적사항.생년월일</w:t>
       </w:r>
       <w:proofErr w:type="gramEnd"/>
       <w:r>
+        <w:rPr>
+          <w:rStyle w:val="1Char"/>
+        </w:rPr>
         <w:t>}</w:t>
       </w:r>
     </w:p>
@@ -102,6 +168,85 @@
       </w:r>
     </w:p>
     <w:p/>
+    <w:p>
+      <w:r>
+        <w:t>[동의 사항]</w:t>
+      </w:r>
+    </w:p>
+    <w:p>
+      <w:r>
+        <w:t>{#체크.동의}</w:t>
+      </w:r>
+      <w:r>
+        <w:rPr>
+          <w:rFonts w:ascii="Segoe UI Symbol" w:hAnsi="Segoe UI Symbol" w:cs="Segoe UI Symbol"/>
+        </w:rPr>
+        <w:t>☑</w:t>
+      </w:r>
+      <w:r>
+        <w:t>{/체크.동의}{^체크.동의}</w:t>
+      </w:r>
+      <w:r>
+        <w:rPr>
+          <w:rFonts w:ascii="Segoe UI Symbol" w:hAnsi="Segoe UI Symbol" w:cs="Segoe UI Symbol"/>
+        </w:rPr>
+        <w:t>☐</w:t>
+      </w:r>
+      <w:r>
+        <w:t>{/체크.동의} 개인정보 수집·이용 동의</w:t>
+      </w:r>
+    </w:p>
+    <w:p>
+      <w:r>
+        <w:t>{#체크.마케팅수신}</w:t>
+      </w:r>
+      <w:r>
+        <w:rPr>
+          <w:rFonts w:ascii="Segoe UI Symbol" w:hAnsi="Segoe UI Symbol" w:cs="Segoe UI Symbol"/>
+        </w:rPr>
+        <w:t>☑</w:t>
+      </w:r>
+      <w:r>
+        <w:t>{/체크.마케팅수신}{^체크.마케팅수신}</w:t>
+      </w:r>
+      <w:r>
+        <w:rPr>
+          <w:rFonts w:ascii="Segoe UI Symbol" w:hAnsi="Segoe UI Symbol" w:cs="Segoe UI Symbol"/>
+        </w:rPr>
+        <w:t>☐</w:t>
+      </w:r>
+      <w:r>
+        <w:t>{/체크.마케팅수신} 마케팅 정보 수신 동의</w:t>
+      </w:r>
+    </w:p>
+    <w:p>
+      <w:pPr>
+        <w:rPr>
+          <w:rFonts w:hint="eastAsia"/>
+        </w:rPr>
+      </w:pPr>
+      <w:r>
+        <w:t>{#체크.운전면허}</w:t>
+      </w:r>
+      <w:r>
+        <w:rPr>
+          <w:rFonts w:ascii="Segoe UI Symbol" w:hAnsi="Segoe UI Symbol" w:cs="Segoe UI Symbol"/>
+        </w:rPr>
+        <w:t>☑</w:t>
+      </w:r>
+      <w:r>
+        <w:t>{/체크.운전면허}{^체크.운전면허}</w:t>
+      </w:r>
+      <w:r>
+        <w:rPr>
+          <w:rFonts w:ascii="Segoe UI Symbol" w:hAnsi="Segoe UI Symbol" w:cs="Segoe UI Symbol"/>
+        </w:rPr>
+        <w:t>☐</w:t>
+      </w:r>
+      <w:r>
+        <w:t>{/체크.운전면허} 운전면허 보유</w:t>
+      </w:r>
+    </w:p>
     <w:sectPr>
       <w:pgSz w:w="11906" w:h="16838"/>
       <w:pgMar w:top="1701" w:right="1440" w:bottom="1440" w:left="1440" w:header="851" w:footer="992" w:gutter="0"/>
@@ -719,6 +864,7 @@
   <w:style w:type="character" w:default="1" w:styleId="a0">
     <w:name w:val="Default Paragraph Font"/>
     <w:uiPriority w:val="1"/>
+    <w:semiHidden/>
     <w:unhideWhenUsed/>
   </w:style>
   <w:style w:type="table" w:default="1" w:styleId="a1">

</xml_diff>